<commit_message>
Use g = 9.81 m/s^2 and recompute affected problems (P4b: 2.75 s -> 2.74 s)
</commit_message>
<xml_diff>
--- a/Kinematics_Solution_Key.docx
+++ b/Kinematics_Solution_Key.docx
@@ -56,7 +56,7 @@
           <w:sz w:val="19"/>
           <w:szCs w:val="19"/>
         </w:rPr>
-        <w:t>Sign convention used throughout: unless stated otherwise, the direction of the initial velocity (or the direction pointing away from the starting point) is taken as positive, and free-fall acceleration is g = 9.80 m/s², directed toward the ground.</w:t>
+        <w:t>Sign convention used throughout: unless stated otherwise, the direction of the initial velocity (or the direction pointing away from the starting point) is taken as positive, and free-fall acceleration is g = 9.81 m/s², directed toward the ground.</w:t>
       </w:r>
     </w:p>
     <w:p>
@@ -221,7 +221,7 @@
               </w:numPr>
             </w:pPr>
             <w:r>
-              <w:t xml:space="preserve">a = −g = −9.80 m/s</w:t>
+              <w:t xml:space="preserve">a = −g = −9.81 m/s</w:t>
             </w:r>
             <w:r>
               <w:rPr>
@@ -931,7 +931,7 @@
           <w:sz w:val="24"/>
           <w:szCs w:val="24"/>
         </w:rPr>
-        <w:t xml:space="preserve">t = −2(8.20)/(−9.80)</w:t>
+        <w:t xml:space="preserve">t = −2(8.20)/(−9.81)</w:t>
       </w:r>
     </w:p>
     <w:p>
@@ -1333,7 +1333,7 @@
               <w:t xml:space="preserve">air</w:t>
             </w:r>
             <w:r>
-              <w:t xml:space="preserve"> = −g = −9.80 m/s</w:t>
+              <w:t xml:space="preserve"> = −g = −9.81 m/s</w:t>
             </w:r>
             <w:r>
               <w:rPr>
@@ -2357,7 +2357,7 @@
           <w:sz w:val="24"/>
           <w:szCs w:val="24"/>
         </w:rPr>
-        <w:t xml:space="preserve">/(2(−9.80))</w:t>
+        <w:t xml:space="preserve">/(2(−9.81))</w:t>
       </w:r>
     </w:p>
     <w:p>
@@ -2617,7 +2617,7 @@
               </w:numPr>
             </w:pPr>
             <w:r>
-              <w:t xml:space="preserve">a = −g = −9.80 m/s</w:t>
+              <w:t xml:space="preserve">a = −g = −9.81 m/s</w:t>
             </w:r>
             <w:r>
               <w:rPr>
@@ -3214,7 +3214,7 @@
           <w:sz w:val="24"/>
           <w:szCs w:val="24"/>
         </w:rPr>
-        <w:t xml:space="preserve"> − 2(−9.80)(5.0))</w:t>
+        <w:t xml:space="preserve"> − 2(−9.81)(5.0))</w:t>
       </w:r>
     </w:p>
     <w:p>
@@ -3574,7 +3574,7 @@
               </w:numPr>
             </w:pPr>
             <w:r>
-              <w:t xml:space="preserve">a = −g = −9.80 m/s</w:t>
+              <w:t xml:space="preserve">a = −g = −9.81 m/s</w:t>
             </w:r>
             <w:r>
               <w:rPr>
@@ -4048,7 +4048,7 @@
           <w:sz w:val="24"/>
           <w:szCs w:val="24"/>
         </w:rPr>
-        <w:t xml:space="preserve">4.00 = 12.0t + ½(−9.80)t</w:t>
+        <w:t xml:space="preserve">4.00 = 12.0t + ½(−9.81)t</w:t>
       </w:r>
       <w:r>
         <w:rPr>
@@ -4071,7 +4071,7 @@
           <w:sz w:val="24"/>
           <w:szCs w:val="24"/>
         </w:rPr>
-        <w:t xml:space="preserve">4.90t</w:t>
+        <w:t xml:space="preserve">4.905t</w:t>
       </w:r>
       <w:r>
         <w:rPr>
@@ -4124,7 +4124,7 @@
           <w:sz w:val="19"/>
           <w:szCs w:val="19"/>
         </w:rPr>
-        <w:t xml:space="preserve"> + Bt + C = 0 with A = 4.90, B = −12.0, C = 4.00. Solve with the quadratic formula.</w:t>
+        <w:t xml:space="preserve"> + Bt + C = 0 with A = 4.905, B = −12.0, C = 4.00. Solve with the quadratic formula.</w:t>
       </w:r>
     </w:p>
     <w:p>
@@ -4197,7 +4197,7 @@
           <w:sz w:val="24"/>
           <w:szCs w:val="24"/>
         </w:rPr>
-        <w:t xml:space="preserve"> − 4(4.90)(4.00))] / (2(4.90))</w:t>
+        <w:t xml:space="preserve"> − 4(4.905)(4.00))] / (2(4.905))</w:t>
       </w:r>
     </w:p>
     <w:p>
@@ -4211,7 +4211,7 @@
           <w:sz w:val="24"/>
           <w:szCs w:val="24"/>
         </w:rPr>
-        <w:t xml:space="preserve">t = [12.0 ± √(65.6)] / 9.80</w:t>
+        <w:t xml:space="preserve">t = [12.0 ± √(65.52)] / 9.81</w:t>
       </w:r>
     </w:p>
     <w:p>
@@ -4490,7 +4490,7 @@
           <w:sz w:val="24"/>
           <w:szCs w:val="24"/>
         </w:rPr>
-        <w:t xml:space="preserve">−4.00 = 12.0t + ½(−9.80)t</w:t>
+        <w:t xml:space="preserve">−4.00 = 12.0t + ½(−9.81)t</w:t>
       </w:r>
       <w:r>
         <w:rPr>
@@ -4513,7 +4513,7 @@
           <w:sz w:val="24"/>
           <w:szCs w:val="24"/>
         </w:rPr>
-        <w:t xml:space="preserve">−4.00 = 12.0t − 4.90t</w:t>
+        <w:t xml:space="preserve">−4.00 = 12.0t − 4.905t</w:t>
       </w:r>
       <w:r>
         <w:rPr>
@@ -4536,7 +4536,7 @@
           <w:sz w:val="24"/>
           <w:szCs w:val="24"/>
         </w:rPr>
-        <w:t xml:space="preserve">4.90t</w:t>
+        <w:t xml:space="preserve">4.905t</w:t>
       </w:r>
       <w:r>
         <w:rPr>
@@ -4568,7 +4568,7 @@
           <w:sz w:val="19"/>
           <w:szCs w:val="19"/>
         </w:rPr>
-        <w:t xml:space="preserve">Now A = 4.90, B = −12.0, C = −4.00.</w:t>
+        <w:t xml:space="preserve">Now A = 4.905, B = −12.0, C = −4.00.</w:t>
       </w:r>
     </w:p>
     <w:p>
@@ -4616,7 +4616,7 @@
           <w:sz w:val="24"/>
           <w:szCs w:val="24"/>
         </w:rPr>
-        <w:t xml:space="preserve"> − 4(4.90)(−4.00))] / (2(4.90))</w:t>
+        <w:t xml:space="preserve"> − 4(4.905)(−4.00))] / (2(4.905))</w:t>
       </w:r>
     </w:p>
     <w:p>
@@ -4630,7 +4630,7 @@
           <w:sz w:val="24"/>
           <w:szCs w:val="24"/>
         </w:rPr>
-        <w:t xml:space="preserve">t = [12.0 ± √(222.4)] / 9.80</w:t>
+        <w:t xml:space="preserve">t = [12.0 ± √(222.48)] / 9.81</w:t>
       </w:r>
     </w:p>
     <w:p>
@@ -4645,7 +4645,7 @@
           <w:sz w:val="19"/>
           <w:szCs w:val="19"/>
         </w:rPr>
-        <w:t xml:space="preserve">This gives t = 2.75 s or t = −0.297 s. A negative time has no physical meaning here (the rock leaves the hand at t = 0), so it is rejected.</w:t>
+        <w:t xml:space="preserve">This gives t = 2.74 s or t = −0.297 s. A negative time has no physical meaning here (the rock leaves the hand at t = 0), so it is rejected.</w:t>
       </w:r>
     </w:p>
     <w:p>
@@ -4668,7 +4668,7 @@
           <w:sz w:val="26"/>
           <w:szCs w:val="26"/>
         </w:rPr>
-        <w:t>t = 2.75 s</w:t>
+        <w:t>t = 2.74 s</w:t>
       </w:r>
     </w:p>
     <w:p>
@@ -4834,7 +4834,7 @@
               </w:numPr>
             </w:pPr>
             <w:r>
-              <w:t>a = g = 9.80 m/s</w:t>
+              <w:t>a = g = 9.81 m/s</w:t>
             </w:r>
             <w:r>
               <w:rPr>
@@ -5251,7 +5251,7 @@
           <w:sz w:val="24"/>
           <w:szCs w:val="24"/>
         </w:rPr>
-        <w:t xml:space="preserve">5.00 = 9.00t + ½(9.80)t</w:t>
+        <w:t xml:space="preserve">5.00 = 9.00t + ½(9.81)t</w:t>
       </w:r>
       <w:r>
         <w:rPr>
@@ -5274,7 +5274,7 @@
           <w:sz w:val="24"/>
           <w:szCs w:val="24"/>
         </w:rPr>
-        <w:t xml:space="preserve">4.90t</w:t>
+        <w:t xml:space="preserve">4.905t</w:t>
       </w:r>
       <w:r>
         <w:rPr>
@@ -5306,7 +5306,7 @@
           <w:sz w:val="19"/>
           <w:szCs w:val="19"/>
         </w:rPr>
-        <w:t xml:space="preserve">Here A = 4.90, B = 9.00, C = −5.00.</w:t>
+        <w:t xml:space="preserve">Here A = 4.905, B = 9.00, C = −5.00.</w:t>
       </w:r>
     </w:p>
     <w:p>
@@ -5379,7 +5379,7 @@
           <w:sz w:val="24"/>
           <w:szCs w:val="24"/>
         </w:rPr>
-        <w:t xml:space="preserve"> − 4(4.90)(−5.00))] / (2(4.90))</w:t>
+        <w:t xml:space="preserve"> − 4(4.905)(−5.00))] / (2(4.905))</w:t>
       </w:r>
     </w:p>
     <w:p>
@@ -5393,7 +5393,7 @@
           <w:sz w:val="24"/>
           <w:szCs w:val="24"/>
         </w:rPr>
-        <w:t xml:space="preserve">t = [−9.00 ± √(179)] / 9.80</w:t>
+        <w:t xml:space="preserve">t = [−9.00 ± √(179.1)] / 9.81</w:t>
       </w:r>
     </w:p>
     <w:p>

</xml_diff>